<commit_message>
adding info about added nutrients
</commit_message>
<xml_diff>
--- a/InstructionGuide_EJL.docx
+++ b/InstructionGuide_EJL.docx
@@ -114,50 +114,14 @@
         <w:rPr>
           <w:lang w:val="en-CA"/>
         </w:rPr>
-        <w:t xml:space="preserve">Where is </w:t>
-      </w:r>
-      <w:proofErr w:type="gramStart"/>
-      <w:r>
-        <w:rPr>
-          <w:lang w:val="en-CA"/>
-        </w:rPr>
-        <w:t>the  specific</w:t>
-      </w:r>
-      <w:proofErr w:type="gramEnd"/>
-      <w:r>
-        <w:rPr>
-          <w:lang w:val="en-CA"/>
-        </w:rPr>
-        <w:t xml:space="preserve"> place the water and organisms were collected from/where the experiment took place?</w:t>
-      </w:r>
-      <w:r>
-        <w:rPr>
-          <w:lang w:val="en-CA"/>
-        </w:rPr>
-        <w:t xml:space="preserve"> </w:t>
-      </w:r>
-      <w:proofErr w:type="spellStart"/>
-      <w:r>
-        <w:rPr>
-          <w:lang w:val="en-CA"/>
-        </w:rPr>
-        <w:t>Eg.</w:t>
-      </w:r>
-      <w:proofErr w:type="spellEnd"/>
-      <w:r>
-        <w:rPr>
-          <w:lang w:val="en-CA"/>
-        </w:rPr>
-        <w:t xml:space="preserve"> </w:t>
-      </w:r>
-      <w:proofErr w:type="spellStart"/>
-      <w:r>
-        <w:rPr>
-          <w:lang w:val="en-CA"/>
-        </w:rPr>
-        <w:t>Bamfield</w:t>
-      </w:r>
-      <w:proofErr w:type="spellEnd"/>
+        <w:t>Where is the  specific place the water and organisms were collected from/where the experiment took place?</w:t>
+      </w:r>
+      <w:r>
+        <w:rPr>
+          <w:lang w:val="en-CA"/>
+        </w:rPr>
+        <w:t xml:space="preserve"> Eg. Bamfield</w:t>
+      </w:r>
     </w:p>
     <w:p>
       <w:pPr>
@@ -415,21 +379,7 @@
         <w:rPr>
           <w:lang w:val="en-CA"/>
         </w:rPr>
-        <w:t xml:space="preserve"> </w:t>
-      </w:r>
-      <w:proofErr w:type="spellStart"/>
-      <w:r>
-        <w:rPr>
-          <w:lang w:val="en-CA"/>
-        </w:rPr>
-        <w:t>Eg.</w:t>
-      </w:r>
-      <w:proofErr w:type="spellEnd"/>
-      <w:r>
-        <w:rPr>
-          <w:lang w:val="en-CA"/>
-        </w:rPr>
-        <w:t xml:space="preserve"> North Atlantic vs South Atlantic</w:t>
+        <w:t xml:space="preserve"> Eg. North Atlantic vs South Atlantic</w:t>
       </w:r>
     </w:p>
     <w:p>
@@ -537,7 +487,6 @@
           <w:lang w:val="en-CA"/>
         </w:rPr>
       </w:pPr>
-      <w:proofErr w:type="spellStart"/>
       <w:r>
         <w:rPr>
           <w:b/>
@@ -554,7 +503,6 @@
         </w:rPr>
         <w:t>limate_zone</w:t>
       </w:r>
-      <w:proofErr w:type="spellEnd"/>
       <w:r>
         <w:rPr>
           <w:b/>
@@ -1010,7 +958,6 @@
           <w:lang w:val="en-CA"/>
         </w:rPr>
       </w:pPr>
-      <w:proofErr w:type="spellStart"/>
       <w:r>
         <w:rPr>
           <w:b/>
@@ -1027,7 +974,6 @@
         </w:rPr>
         <w:t>ater_body</w:t>
       </w:r>
-      <w:proofErr w:type="spellEnd"/>
       <w:r>
         <w:rPr>
           <w:b/>
@@ -1040,39 +986,24 @@
         <w:rPr>
           <w:lang w:val="en-CA"/>
         </w:rPr>
-        <w:t xml:space="preserve">– What kind of water body was the experiment conducted in/organisms collected from? Tide pools, shallow subtidal, lagoon, </w:t>
-      </w:r>
-      <w:proofErr w:type="spellStart"/>
-      <w:r>
-        <w:rPr>
-          <w:lang w:val="en-CA"/>
-        </w:rPr>
-        <w:t>etc</w:t>
-      </w:r>
-      <w:proofErr w:type="spellEnd"/>
-      <w:r>
-        <w:rPr>
-          <w:lang w:val="en-CA"/>
-        </w:rPr>
-        <w:t>? Use the descriptive term given by the authors</w:t>
-      </w:r>
-    </w:p>
-    <w:p>
-      <w:pPr>
-        <w:rPr>
-          <w:lang w:val="en-CA"/>
-        </w:rPr>
-      </w:pPr>
-    </w:p>
-    <w:p>
-      <w:pPr>
-        <w:rPr>
-          <w:b/>
-          <w:bCs/>
-          <w:lang w:val="en-CA"/>
-        </w:rPr>
-      </w:pPr>
-      <w:proofErr w:type="spellStart"/>
+        <w:t>– What kind of water body was the experiment conducted in/organisms collected from? Tide pools, shallow subtidal, lagoon, etc? Use the descriptive term given by the authors</w:t>
+      </w:r>
+    </w:p>
+    <w:p>
+      <w:pPr>
+        <w:rPr>
+          <w:lang w:val="en-CA"/>
+        </w:rPr>
+      </w:pPr>
+    </w:p>
+    <w:p>
+      <w:pPr>
+        <w:rPr>
+          <w:b/>
+          <w:bCs/>
+          <w:lang w:val="en-CA"/>
+        </w:rPr>
+      </w:pPr>
       <w:r>
         <w:rPr>
           <w:b/>
@@ -1081,7 +1012,6 @@
         </w:rPr>
         <w:t>nutrient_levels</w:t>
       </w:r>
-      <w:proofErr w:type="spellEnd"/>
       <w:r>
         <w:rPr>
           <w:lang w:val="en-CA"/>
@@ -1102,23 +1032,13 @@
           <w:lang w:val="en-CA"/>
         </w:rPr>
       </w:pPr>
-      <w:proofErr w:type="spellStart"/>
-      <w:r>
-        <w:rPr>
-          <w:b/>
-          <w:bCs/>
-          <w:lang w:val="en-CA"/>
-        </w:rPr>
-        <w:t>lab_field</w:t>
-      </w:r>
-      <w:proofErr w:type="spellEnd"/>
-      <w:r>
-        <w:rPr>
-          <w:b/>
-          <w:bCs/>
-          <w:lang w:val="en-CA"/>
-        </w:rPr>
-        <w:t xml:space="preserve"> </w:t>
+      <w:r>
+        <w:rPr>
+          <w:b/>
+          <w:bCs/>
+          <w:lang w:val="en-CA"/>
+        </w:rPr>
+        <w:t xml:space="preserve">lab_field </w:t>
       </w:r>
       <w:r>
         <w:rPr>
@@ -1345,21 +1265,7 @@
         <w:rPr>
           <w:lang w:val="en-CA"/>
         </w:rPr>
-        <w:t xml:space="preserve">Field enclosures where animal </w:t>
-      </w:r>
-      <w:proofErr w:type="gramStart"/>
-      <w:r>
-        <w:rPr>
-          <w:lang w:val="en-CA"/>
-        </w:rPr>
-        <w:t>were</w:t>
-      </w:r>
-      <w:proofErr w:type="gramEnd"/>
-      <w:r>
-        <w:rPr>
-          <w:lang w:val="en-CA"/>
-        </w:rPr>
-        <w:t xml:space="preserve"> manipulated</w:t>
+        <w:t>Field enclosures where animal were manipulated</w:t>
       </w:r>
     </w:p>
     <w:p>
@@ -1487,23 +1393,7 @@
           <w:strike/>
           <w:lang w:val="en-CA"/>
         </w:rPr>
-        <w:t xml:space="preserve">(2) field: </w:t>
-      </w:r>
-      <w:proofErr w:type="spellStart"/>
-      <w:r>
-        <w:rPr>
-          <w:strike/>
-          <w:lang w:val="en-CA"/>
-        </w:rPr>
-        <w:t>unstocked</w:t>
-      </w:r>
-      <w:proofErr w:type="spellEnd"/>
-      <w:r>
-        <w:rPr>
-          <w:strike/>
-          <w:lang w:val="en-CA"/>
-        </w:rPr>
-        <w:t xml:space="preserve"> enclosure</w:t>
+        <w:t>(2) field: unstocked enclosure</w:t>
       </w:r>
     </w:p>
     <w:p>
@@ -1538,21 +1428,12 @@
           <w:lang w:val="en-CA"/>
         </w:rPr>
       </w:pPr>
-      <w:proofErr w:type="spellStart"/>
       <w:r>
         <w:rPr>
           <w:strike/>
           <w:lang w:val="en-CA"/>
         </w:rPr>
-        <w:t>Eg.</w:t>
-      </w:r>
-      <w:proofErr w:type="spellEnd"/>
-      <w:r>
-        <w:rPr>
-          <w:strike/>
-          <w:lang w:val="en-CA"/>
-        </w:rPr>
-        <w:t xml:space="preserve"> transplant experiment?</w:t>
+        <w:t>Eg. transplant experiment?</w:t>
       </w:r>
     </w:p>
     <w:p>
@@ -1661,21 +1542,7 @@
         <w:rPr>
           <w:lang w:val="en-CA"/>
         </w:rPr>
-        <w:t xml:space="preserve"> Use your best estimate if the study doesn’t neatly fit into one of these categories perfectly. </w:t>
-      </w:r>
-      <w:proofErr w:type="spellStart"/>
-      <w:r>
-        <w:rPr>
-          <w:lang w:val="en-CA"/>
-        </w:rPr>
-        <w:t>Eg.</w:t>
-      </w:r>
-      <w:proofErr w:type="spellEnd"/>
-      <w:r>
-        <w:rPr>
-          <w:lang w:val="en-CA"/>
-        </w:rPr>
-        <w:t xml:space="preserve"> winter, spring-summer. </w:t>
+        <w:t xml:space="preserve"> Use your best estimate if the study doesn’t neatly fit into one of these categories perfectly. Eg. winter, spring-summer. </w:t>
       </w:r>
     </w:p>
     <w:p>
@@ -1811,7 +1678,6 @@
           <w:lang w:val="en-CA"/>
         </w:rPr>
       </w:pPr>
-      <w:proofErr w:type="spellStart"/>
       <w:r>
         <w:rPr>
           <w:b/>
@@ -1820,7 +1686,6 @@
         </w:rPr>
         <w:t>year_of_study</w:t>
       </w:r>
-      <w:proofErr w:type="spellEnd"/>
       <w:r>
         <w:rPr>
           <w:lang w:val="en-CA"/>
@@ -1831,37 +1696,22 @@
         <w:rPr>
           <w:lang w:val="en-CA"/>
         </w:rPr>
-        <w:t xml:space="preserve"> If the study spanned multiple years indicate the range. </w:t>
-      </w:r>
-      <w:proofErr w:type="spellStart"/>
-      <w:r>
-        <w:rPr>
-          <w:lang w:val="en-CA"/>
-        </w:rPr>
-        <w:t>Eg.</w:t>
-      </w:r>
-      <w:proofErr w:type="spellEnd"/>
-      <w:r>
-        <w:rPr>
-          <w:lang w:val="en-CA"/>
-        </w:rPr>
-        <w:t xml:space="preserve"> 2014-2006</w:t>
-      </w:r>
-    </w:p>
-    <w:p>
-      <w:pPr>
-        <w:rPr>
-          <w:lang w:val="en-CA"/>
-        </w:rPr>
-      </w:pPr>
-    </w:p>
-    <w:p>
-      <w:pPr>
-        <w:rPr>
-          <w:lang w:val="en-CA"/>
-        </w:rPr>
-      </w:pPr>
-      <w:proofErr w:type="spellStart"/>
+        <w:t xml:space="preserve"> If the study spanned multiple years indicate the range. Eg. 2014-2006</w:t>
+      </w:r>
+    </w:p>
+    <w:p>
+      <w:pPr>
+        <w:rPr>
+          <w:lang w:val="en-CA"/>
+        </w:rPr>
+      </w:pPr>
+    </w:p>
+    <w:p>
+      <w:pPr>
+        <w:rPr>
+          <w:lang w:val="en-CA"/>
+        </w:rPr>
+      </w:pPr>
       <w:r>
         <w:rPr>
           <w:b/>
@@ -1878,7 +1728,6 @@
         </w:rPr>
         <w:t>_species_family_comm</w:t>
       </w:r>
-      <w:proofErr w:type="spellEnd"/>
       <w:r>
         <w:rPr>
           <w:lang w:val="en-CA"/>
@@ -1953,7 +1802,6 @@
           <w:lang w:val="en-CA"/>
         </w:rPr>
       </w:pPr>
-      <w:proofErr w:type="spellStart"/>
       <w:r>
         <w:rPr>
           <w:b/>
@@ -1962,7 +1810,6 @@
         </w:rPr>
         <w:t>c_family</w:t>
       </w:r>
-      <w:proofErr w:type="spellEnd"/>
       <w:r>
         <w:rPr>
           <w:lang w:val="en-CA"/>
@@ -2001,7 +1848,6 @@
           <w:lang w:val="en-CA"/>
         </w:rPr>
       </w:pPr>
-      <w:proofErr w:type="spellStart"/>
       <w:r>
         <w:rPr>
           <w:b/>
@@ -2010,7 +1856,6 @@
         </w:rPr>
         <w:t>c_taxa</w:t>
       </w:r>
-      <w:proofErr w:type="spellEnd"/>
       <w:r>
         <w:rPr>
           <w:lang w:val="en-CA"/>
@@ -2177,7 +2022,6 @@
           <w:lang w:val="en-CA"/>
         </w:rPr>
       </w:pPr>
-      <w:proofErr w:type="spellStart"/>
       <w:r>
         <w:rPr>
           <w:b/>
@@ -2186,42 +2030,26 @@
         </w:rPr>
         <w:t>c_phyla</w:t>
       </w:r>
-      <w:proofErr w:type="spellEnd"/>
-      <w:r>
-        <w:rPr>
-          <w:lang w:val="en-CA"/>
-        </w:rPr>
-        <w:t xml:space="preserve"> – state phylum name of the consumers, </w:t>
-      </w:r>
-      <w:proofErr w:type="spellStart"/>
-      <w:r>
-        <w:rPr>
-          <w:lang w:val="en-CA"/>
-        </w:rPr>
-        <w:t>eg.</w:t>
-      </w:r>
-      <w:proofErr w:type="spellEnd"/>
-      <w:r>
-        <w:rPr>
-          <w:lang w:val="en-CA"/>
-        </w:rPr>
-        <w:t xml:space="preserve"> Echinodermata</w:t>
-      </w:r>
-    </w:p>
-    <w:p>
-      <w:pPr>
-        <w:rPr>
-          <w:lang w:val="en-CA"/>
-        </w:rPr>
-      </w:pPr>
-    </w:p>
-    <w:p>
-      <w:pPr>
-        <w:rPr>
-          <w:lang w:val="en-CA"/>
-        </w:rPr>
-      </w:pPr>
-      <w:proofErr w:type="spellStart"/>
+      <w:r>
+        <w:rPr>
+          <w:lang w:val="en-CA"/>
+        </w:rPr>
+        <w:t xml:space="preserve"> – state phylum name of the consumers, eg. Echinodermata</w:t>
+      </w:r>
+    </w:p>
+    <w:p>
+      <w:pPr>
+        <w:rPr>
+          <w:lang w:val="en-CA"/>
+        </w:rPr>
+      </w:pPr>
+    </w:p>
+    <w:p>
+      <w:pPr>
+        <w:rPr>
+          <w:lang w:val="en-CA"/>
+        </w:rPr>
+      </w:pPr>
       <w:r>
         <w:rPr>
           <w:b/>
@@ -2230,50 +2058,26 @@
         </w:rPr>
         <w:t>c_genus</w:t>
       </w:r>
-      <w:proofErr w:type="spellEnd"/>
-      <w:r>
-        <w:rPr>
-          <w:lang w:val="en-CA"/>
-        </w:rPr>
-        <w:t xml:space="preserve"> – consumer’s genus name, </w:t>
-      </w:r>
-      <w:proofErr w:type="spellStart"/>
-      <w:r>
-        <w:rPr>
-          <w:lang w:val="en-CA"/>
-        </w:rPr>
-        <w:t>eg</w:t>
-      </w:r>
-      <w:proofErr w:type="spellEnd"/>
-      <w:r>
-        <w:rPr>
-          <w:lang w:val="en-CA"/>
-        </w:rPr>
-        <w:t xml:space="preserve"> </w:t>
-      </w:r>
-      <w:proofErr w:type="spellStart"/>
-      <w:r>
-        <w:rPr>
-          <w:lang w:val="en-CA"/>
-        </w:rPr>
-        <w:t>Pisaster</w:t>
-      </w:r>
-      <w:proofErr w:type="spellEnd"/>
-    </w:p>
-    <w:p>
-      <w:pPr>
-        <w:rPr>
-          <w:lang w:val="en-CA"/>
-        </w:rPr>
-      </w:pPr>
-    </w:p>
-    <w:p>
-      <w:pPr>
-        <w:rPr>
-          <w:lang w:val="en-CA"/>
-        </w:rPr>
-      </w:pPr>
-      <w:proofErr w:type="spellStart"/>
+      <w:r>
+        <w:rPr>
+          <w:lang w:val="en-CA"/>
+        </w:rPr>
+        <w:t xml:space="preserve"> – consumer’s genus name, eg Pisaster</w:t>
+      </w:r>
+    </w:p>
+    <w:p>
+      <w:pPr>
+        <w:rPr>
+          <w:lang w:val="en-CA"/>
+        </w:rPr>
+      </w:pPr>
+    </w:p>
+    <w:p>
+      <w:pPr>
+        <w:rPr>
+          <w:lang w:val="en-CA"/>
+        </w:rPr>
+      </w:pPr>
       <w:r>
         <w:rPr>
           <w:b/>
@@ -2282,50 +2086,26 @@
         </w:rPr>
         <w:t>c_species</w:t>
       </w:r>
-      <w:proofErr w:type="spellEnd"/>
-      <w:r>
-        <w:rPr>
-          <w:lang w:val="en-CA"/>
-        </w:rPr>
-        <w:t xml:space="preserve"> – consumer’s species name, </w:t>
-      </w:r>
-      <w:proofErr w:type="spellStart"/>
-      <w:r>
-        <w:rPr>
-          <w:lang w:val="en-CA"/>
-        </w:rPr>
-        <w:t>eg</w:t>
-      </w:r>
-      <w:proofErr w:type="spellEnd"/>
-      <w:r>
-        <w:rPr>
-          <w:lang w:val="en-CA"/>
-        </w:rPr>
-        <w:t xml:space="preserve"> </w:t>
-      </w:r>
-      <w:proofErr w:type="spellStart"/>
-      <w:r>
-        <w:rPr>
-          <w:lang w:val="en-CA"/>
-        </w:rPr>
-        <w:t>ochraceus</w:t>
-      </w:r>
-      <w:proofErr w:type="spellEnd"/>
-    </w:p>
-    <w:p>
-      <w:pPr>
-        <w:rPr>
-          <w:lang w:val="en-CA"/>
-        </w:rPr>
-      </w:pPr>
-    </w:p>
-    <w:p>
-      <w:pPr>
-        <w:rPr>
-          <w:lang w:val="en-CA"/>
-        </w:rPr>
-      </w:pPr>
-      <w:proofErr w:type="spellStart"/>
+      <w:r>
+        <w:rPr>
+          <w:lang w:val="en-CA"/>
+        </w:rPr>
+        <w:t xml:space="preserve"> – consumer’s species name, eg ochraceus</w:t>
+      </w:r>
+    </w:p>
+    <w:p>
+      <w:pPr>
+        <w:rPr>
+          <w:lang w:val="en-CA"/>
+        </w:rPr>
+      </w:pPr>
+    </w:p>
+    <w:p>
+      <w:pPr>
+        <w:rPr>
+          <w:lang w:val="en-CA"/>
+        </w:rPr>
+      </w:pPr>
       <w:r>
         <w:rPr>
           <w:b/>
@@ -2350,7 +2130,6 @@
         </w:rPr>
         <w:t>_species_family_comm</w:t>
       </w:r>
-      <w:proofErr w:type="spellEnd"/>
       <w:r>
         <w:rPr>
           <w:lang w:val="en-CA"/>
@@ -2425,7 +2204,6 @@
           <w:lang w:val="en-CA"/>
         </w:rPr>
       </w:pPr>
-      <w:proofErr w:type="spellStart"/>
       <w:r>
         <w:rPr>
           <w:b/>
@@ -2450,7 +2228,6 @@
         </w:rPr>
         <w:t>_family</w:t>
       </w:r>
-      <w:proofErr w:type="spellEnd"/>
       <w:r>
         <w:rPr>
           <w:lang w:val="en-CA"/>
@@ -2471,7 +2248,6 @@
           <w:lang w:val="en-CA"/>
         </w:rPr>
       </w:pPr>
-      <w:proofErr w:type="spellStart"/>
       <w:r>
         <w:rPr>
           <w:b/>
@@ -2488,7 +2264,6 @@
         </w:rPr>
         <w:t>p_taxa</w:t>
       </w:r>
-      <w:proofErr w:type="spellEnd"/>
       <w:r>
         <w:rPr>
           <w:lang w:val="en-CA"/>
@@ -2637,21 +2412,7 @@
         <w:rPr>
           <w:lang w:val="en-CA"/>
         </w:rPr>
-        <w:t>(</w:t>
-      </w:r>
-      <w:proofErr w:type="spellStart"/>
-      <w:r>
-        <w:rPr>
-          <w:lang w:val="en-CA"/>
-        </w:rPr>
-        <w:t>En</w:t>
-      </w:r>
-      <w:proofErr w:type="spellEnd"/>
-      <w:r>
-        <w:rPr>
-          <w:lang w:val="en-CA"/>
-        </w:rPr>
-        <w:t>) Endosymbiont</w:t>
+        <w:t>(En) Endosymbiont</w:t>
       </w:r>
     </w:p>
     <w:p>
@@ -2698,7 +2459,6 @@
           <w:lang w:val="en-CA"/>
         </w:rPr>
       </w:pPr>
-      <w:proofErr w:type="spellStart"/>
       <w:r>
         <w:rPr>
           <w:b/>
@@ -2723,42 +2483,26 @@
         </w:rPr>
         <w:t>_phyla</w:t>
       </w:r>
-      <w:proofErr w:type="spellEnd"/>
-      <w:r>
-        <w:rPr>
-          <w:lang w:val="en-CA"/>
-        </w:rPr>
-        <w:t xml:space="preserve"> – state phylum name of the primary producer, </w:t>
-      </w:r>
-      <w:proofErr w:type="spellStart"/>
-      <w:r>
-        <w:rPr>
-          <w:lang w:val="en-CA"/>
-        </w:rPr>
-        <w:t>eg.</w:t>
-      </w:r>
-      <w:proofErr w:type="spellEnd"/>
-      <w:r>
-        <w:rPr>
-          <w:lang w:val="en-CA"/>
-        </w:rPr>
-        <w:t xml:space="preserve"> Echinodermata</w:t>
-      </w:r>
-    </w:p>
-    <w:p>
-      <w:pPr>
-        <w:rPr>
-          <w:lang w:val="en-CA"/>
-        </w:rPr>
-      </w:pPr>
-    </w:p>
-    <w:p>
-      <w:pPr>
-        <w:rPr>
-          <w:lang w:val="en-CA"/>
-        </w:rPr>
-      </w:pPr>
-      <w:proofErr w:type="spellStart"/>
+      <w:r>
+        <w:rPr>
+          <w:lang w:val="en-CA"/>
+        </w:rPr>
+        <w:t xml:space="preserve"> – state phylum name of the primary producer, eg. Echinodermata</w:t>
+      </w:r>
+    </w:p>
+    <w:p>
+      <w:pPr>
+        <w:rPr>
+          <w:lang w:val="en-CA"/>
+        </w:rPr>
+      </w:pPr>
+    </w:p>
+    <w:p>
+      <w:pPr>
+        <w:rPr>
+          <w:lang w:val="en-CA"/>
+        </w:rPr>
+      </w:pPr>
       <w:r>
         <w:rPr>
           <w:b/>
@@ -2783,50 +2527,26 @@
         </w:rPr>
         <w:t>_genus</w:t>
       </w:r>
-      <w:proofErr w:type="spellEnd"/>
-      <w:r>
-        <w:rPr>
-          <w:lang w:val="en-CA"/>
-        </w:rPr>
-        <w:t xml:space="preserve"> – primary producer’s genus name, </w:t>
-      </w:r>
-      <w:proofErr w:type="spellStart"/>
-      <w:r>
-        <w:rPr>
-          <w:lang w:val="en-CA"/>
-        </w:rPr>
-        <w:t>eg</w:t>
-      </w:r>
-      <w:proofErr w:type="spellEnd"/>
-      <w:r>
-        <w:rPr>
-          <w:lang w:val="en-CA"/>
-        </w:rPr>
-        <w:t xml:space="preserve"> </w:t>
-      </w:r>
-      <w:proofErr w:type="spellStart"/>
-      <w:r>
-        <w:rPr>
-          <w:lang w:val="en-CA"/>
-        </w:rPr>
-        <w:t>Pisaster</w:t>
-      </w:r>
-      <w:proofErr w:type="spellEnd"/>
-    </w:p>
-    <w:p>
-      <w:pPr>
-        <w:rPr>
-          <w:lang w:val="en-CA"/>
-        </w:rPr>
-      </w:pPr>
-    </w:p>
-    <w:p>
-      <w:pPr>
-        <w:rPr>
-          <w:lang w:val="en-CA"/>
-        </w:rPr>
-      </w:pPr>
-      <w:proofErr w:type="spellStart"/>
+      <w:r>
+        <w:rPr>
+          <w:lang w:val="en-CA"/>
+        </w:rPr>
+        <w:t xml:space="preserve"> – primary producer’s genus name, eg Pisaster</w:t>
+      </w:r>
+    </w:p>
+    <w:p>
+      <w:pPr>
+        <w:rPr>
+          <w:lang w:val="en-CA"/>
+        </w:rPr>
+      </w:pPr>
+    </w:p>
+    <w:p>
+      <w:pPr>
+        <w:rPr>
+          <w:lang w:val="en-CA"/>
+        </w:rPr>
+      </w:pPr>
       <w:r>
         <w:rPr>
           <w:b/>
@@ -2851,35 +2571,12 @@
         </w:rPr>
         <w:t>_species</w:t>
       </w:r>
-      <w:proofErr w:type="spellEnd"/>
-      <w:r>
-        <w:rPr>
-          <w:lang w:val="en-CA"/>
-        </w:rPr>
-        <w:t xml:space="preserve"> – primary producer’s species name, </w:t>
-      </w:r>
-      <w:proofErr w:type="spellStart"/>
-      <w:r>
-        <w:rPr>
-          <w:lang w:val="en-CA"/>
-        </w:rPr>
-        <w:t>eg</w:t>
-      </w:r>
-      <w:proofErr w:type="spellEnd"/>
-      <w:r>
-        <w:rPr>
-          <w:lang w:val="en-CA"/>
-        </w:rPr>
-        <w:t xml:space="preserve"> </w:t>
-      </w:r>
-      <w:proofErr w:type="spellStart"/>
-      <w:r>
-        <w:rPr>
-          <w:lang w:val="en-CA"/>
-        </w:rPr>
-        <w:t>ochraceus</w:t>
-      </w:r>
-      <w:proofErr w:type="spellEnd"/>
+      <w:r>
+        <w:rPr>
+          <w:lang w:val="en-CA"/>
+        </w:rPr>
+        <w:t xml:space="preserve"> – primary producer’s species name, eg ochraceus</w:t>
+      </w:r>
     </w:p>
     <w:p>
       <w:pPr>
@@ -2906,37 +2603,22 @@
         <w:rPr>
           <w:lang w:val="en-CA"/>
         </w:rPr>
-        <w:t xml:space="preserve"> – Where is the data presented in the paper? </w:t>
-      </w:r>
-      <w:proofErr w:type="spellStart"/>
-      <w:r>
-        <w:rPr>
-          <w:lang w:val="en-CA"/>
-        </w:rPr>
-        <w:t>Eg.</w:t>
-      </w:r>
-      <w:proofErr w:type="spellEnd"/>
-      <w:r>
-        <w:rPr>
-          <w:lang w:val="en-CA"/>
-        </w:rPr>
-        <w:t xml:space="preserve"> Fig1b, in text, Table2, raw data</w:t>
-      </w:r>
-    </w:p>
-    <w:p>
-      <w:pPr>
-        <w:rPr>
-          <w:lang w:val="en-CA"/>
-        </w:rPr>
-      </w:pPr>
-    </w:p>
-    <w:p>
-      <w:pPr>
-        <w:rPr>
-          <w:lang w:val="en-CA"/>
-        </w:rPr>
-      </w:pPr>
-      <w:proofErr w:type="spellStart"/>
+        <w:t xml:space="preserve"> – Where is the data presented in the paper? Eg. Fig1b, in text, Table2, raw data</w:t>
+      </w:r>
+    </w:p>
+    <w:p>
+      <w:pPr>
+        <w:rPr>
+          <w:lang w:val="en-CA"/>
+        </w:rPr>
+      </w:pPr>
+    </w:p>
+    <w:p>
+      <w:pPr>
+        <w:rPr>
+          <w:lang w:val="en-CA"/>
+        </w:rPr>
+      </w:pPr>
       <w:r>
         <w:rPr>
           <w:b/>
@@ -2945,35 +2627,12 @@
         </w:rPr>
         <w:t>data_source</w:t>
       </w:r>
-      <w:proofErr w:type="spellEnd"/>
-      <w:r>
-        <w:rPr>
-          <w:lang w:val="en-CA"/>
-        </w:rPr>
-        <w:t xml:space="preserve"> – Where did the data come from? </w:t>
-      </w:r>
-      <w:proofErr w:type="spellStart"/>
-      <w:r>
-        <w:rPr>
-          <w:lang w:val="en-CA"/>
-        </w:rPr>
-        <w:t>Eg.</w:t>
-      </w:r>
-      <w:proofErr w:type="spellEnd"/>
-      <w:r>
-        <w:rPr>
-          <w:lang w:val="en-CA"/>
-        </w:rPr>
-        <w:t xml:space="preserve"> in text, </w:t>
-      </w:r>
-      <w:proofErr w:type="spellStart"/>
-      <w:r>
-        <w:rPr>
-          <w:lang w:val="en-CA"/>
-        </w:rPr>
-        <w:t>WebplotDigitizer</w:t>
-      </w:r>
-      <w:proofErr w:type="spellEnd"/>
+      <w:r>
+        <w:rPr>
+          <w:lang w:val="en-CA"/>
+        </w:rPr>
+        <w:t xml:space="preserve"> – Where did the data come from? Eg. in text, WebplotDigitizer</w:t>
+      </w:r>
     </w:p>
     <w:p>
       <w:pPr>
@@ -3001,21 +2660,7 @@
         <w:rPr>
           <w:lang w:val="en-CA"/>
         </w:rPr>
-        <w:t xml:space="preserve"> – What is the treatment? </w:t>
-      </w:r>
-      <w:proofErr w:type="spellStart"/>
-      <w:r>
-        <w:rPr>
-          <w:lang w:val="en-CA"/>
-        </w:rPr>
-        <w:t>Eg.</w:t>
-      </w:r>
-      <w:proofErr w:type="spellEnd"/>
-      <w:r>
-        <w:rPr>
-          <w:lang w:val="en-CA"/>
-        </w:rPr>
-        <w:t xml:space="preserve"> effluent, animal, faeces, proximity to animal</w:t>
+        <w:t xml:space="preserve"> – What is the treatment? Eg. effluent, animal, faeces, proximity to animal</w:t>
       </w:r>
     </w:p>
     <w:p>
@@ -3043,35 +2688,7 @@
         <w:rPr>
           <w:lang w:val="en-CA"/>
         </w:rPr>
-        <w:t xml:space="preserve"> – what did they measure? </w:t>
-      </w:r>
-      <w:proofErr w:type="spellStart"/>
-      <w:r>
-        <w:rPr>
-          <w:lang w:val="en-CA"/>
-        </w:rPr>
-        <w:t>Eg.</w:t>
-      </w:r>
-      <w:proofErr w:type="spellEnd"/>
-      <w:r>
-        <w:rPr>
-          <w:lang w:val="en-CA"/>
-        </w:rPr>
-        <w:t xml:space="preserve"> growth rate? </w:t>
-      </w:r>
-      <w:proofErr w:type="spellStart"/>
-      <w:r>
-        <w:rPr>
-          <w:lang w:val="en-CA"/>
-        </w:rPr>
-        <w:t>chl_a</w:t>
-      </w:r>
-      <w:proofErr w:type="spellEnd"/>
-      <w:r>
-        <w:rPr>
-          <w:lang w:val="en-CA"/>
-        </w:rPr>
-        <w:t>, productivity</w:t>
+        <w:t xml:space="preserve"> – what did they measure? Eg. growth rate? chl_a, productivity</w:t>
       </w:r>
     </w:p>
     <w:p>
@@ -3121,7 +2738,6 @@
           <w:lang w:val="en-CA"/>
         </w:rPr>
       </w:pPr>
-      <w:proofErr w:type="spellStart"/>
       <w:r>
         <w:rPr>
           <w:b/>
@@ -3130,7 +2746,6 @@
         </w:rPr>
         <w:t>mean_treatment</w:t>
       </w:r>
-      <w:proofErr w:type="spellEnd"/>
       <w:r>
         <w:rPr>
           <w:lang w:val="en-CA"/>
@@ -3151,34 +2766,14 @@
           <w:lang w:val="en-CA"/>
         </w:rPr>
       </w:pPr>
-      <w:proofErr w:type="spellStart"/>
-      <w:r>
-        <w:rPr>
-          <w:b/>
-          <w:bCs/>
-          <w:lang w:val="en-CA"/>
-        </w:rPr>
-        <w:t>se_treatment</w:t>
-      </w:r>
-      <w:proofErr w:type="spellEnd"/>
-      <w:r>
-        <w:rPr>
-          <w:b/>
-          <w:bCs/>
-          <w:lang w:val="en-CA"/>
-        </w:rPr>
-        <w:t>/</w:t>
-      </w:r>
-      <w:proofErr w:type="spellStart"/>
-      <w:r>
-        <w:rPr>
-          <w:b/>
-          <w:bCs/>
-          <w:lang w:val="en-CA"/>
-        </w:rPr>
-        <w:t>sd_treatment</w:t>
-      </w:r>
-      <w:proofErr w:type="spellEnd"/>
+      <w:r>
+        <w:rPr>
+          <w:b/>
+          <w:bCs/>
+          <w:lang w:val="en-CA"/>
+        </w:rPr>
+        <w:t>se_treatment/sd_treatment</w:t>
+      </w:r>
       <w:r>
         <w:rPr>
           <w:lang w:val="en-CA"/>
@@ -3199,7 +2794,6 @@
           <w:lang w:val="en-CA"/>
         </w:rPr>
       </w:pPr>
-      <w:proofErr w:type="spellStart"/>
       <w:r>
         <w:rPr>
           <w:b/>
@@ -3208,7 +2802,6 @@
         </w:rPr>
         <w:t>treatment_n</w:t>
       </w:r>
-      <w:proofErr w:type="spellEnd"/>
       <w:r>
         <w:rPr>
           <w:lang w:val="en-CA"/>
@@ -3229,70 +2822,14 @@
           <w:lang w:val="en-CA"/>
         </w:rPr>
       </w:pPr>
-      <w:proofErr w:type="spellStart"/>
-      <w:r>
-        <w:rPr>
-          <w:b/>
-          <w:bCs/>
-          <w:lang w:val="en-CA"/>
-        </w:rPr>
-        <w:t>mean_control</w:t>
-      </w:r>
-      <w:proofErr w:type="spellEnd"/>
-      <w:r>
-        <w:rPr>
-          <w:b/>
-          <w:bCs/>
-          <w:lang w:val="en-CA"/>
-        </w:rPr>
-        <w:t xml:space="preserve">, </w:t>
-      </w:r>
-      <w:proofErr w:type="spellStart"/>
-      <w:r>
-        <w:rPr>
-          <w:b/>
-          <w:bCs/>
-          <w:lang w:val="en-CA"/>
-        </w:rPr>
-        <w:t>se_control</w:t>
-      </w:r>
-      <w:proofErr w:type="spellEnd"/>
-      <w:r>
-        <w:rPr>
-          <w:b/>
-          <w:bCs/>
-          <w:lang w:val="en-CA"/>
-        </w:rPr>
-        <w:t>/</w:t>
-      </w:r>
-      <w:proofErr w:type="spellStart"/>
-      <w:r>
-        <w:rPr>
-          <w:b/>
-          <w:bCs/>
-          <w:lang w:val="en-CA"/>
-        </w:rPr>
-        <w:t>sd_control</w:t>
-      </w:r>
-      <w:proofErr w:type="spellEnd"/>
-      <w:r>
-        <w:rPr>
-          <w:b/>
-          <w:bCs/>
-          <w:lang w:val="en-CA"/>
-        </w:rPr>
-        <w:t xml:space="preserve">, </w:t>
-      </w:r>
-      <w:proofErr w:type="spellStart"/>
-      <w:r>
-        <w:rPr>
-          <w:b/>
-          <w:bCs/>
-          <w:lang w:val="en-CA"/>
-        </w:rPr>
-        <w:t>control_n</w:t>
-      </w:r>
-      <w:proofErr w:type="spellEnd"/>
+      <w:r>
+        <w:rPr>
+          <w:b/>
+          <w:bCs/>
+          <w:lang w:val="en-CA"/>
+        </w:rPr>
+        <w:t>mean_control, se_control/sd_control, control_n</w:t>
+      </w:r>
       <w:r>
         <w:rPr>
           <w:lang w:val="en-CA"/>
@@ -3333,19 +2870,11 @@
           <w:lang w:val="en-CA"/>
         </w:rPr>
       </w:pPr>
-      <w:proofErr w:type="spellStart"/>
-      <w:r>
-        <w:rPr>
-          <w:lang w:val="en-CA"/>
-        </w:rPr>
-        <w:t>nutrient_estimate</w:t>
-      </w:r>
-      <w:proofErr w:type="spellEnd"/>
-      <w:r>
-        <w:rPr>
-          <w:lang w:val="en-CA"/>
-        </w:rPr>
-        <w:t xml:space="preserve"> – was the ammonium </w:t>
+      <w:r>
+        <w:rPr>
+          <w:lang w:val="en-CA"/>
+        </w:rPr>
+        <w:t xml:space="preserve">nutrient_estimate – was the ammonium </w:t>
       </w:r>
     </w:p>
     <w:p>
@@ -3365,6 +2894,12 @@
         </w:rPr>
         <w:t>measured – in situ or in the tank</w:t>
       </w:r>
+      <w:r>
+        <w:rPr>
+          <w:lang w:val="en-CA"/>
+        </w:rPr>
+        <w:t xml:space="preserve"> (umol/L)</w:t>
+      </w:r>
     </w:p>
     <w:p>
       <w:pPr>
@@ -3381,7 +2916,81 @@
         <w:rPr>
           <w:lang w:val="en-CA"/>
         </w:rPr>
-        <w:t>calculated – based on excretion rates</w:t>
+        <w:t xml:space="preserve">calculated – </w:t>
+      </w:r>
+      <w:r>
+        <w:rPr>
+          <w:lang w:val="en-CA"/>
+        </w:rPr>
+        <w:t>Calculated how much nitrogen the consumers provided based on excretion rates</w:t>
+      </w:r>
+    </w:p>
+    <w:p>
+      <w:pPr>
+        <w:pStyle w:val="ListParagraph"/>
+        <w:numPr>
+          <w:ilvl w:val="1"/>
+          <w:numId w:val="16"/>
+        </w:numPr>
+        <w:rPr>
+          <w:lang w:val="en-CA"/>
+        </w:rPr>
+      </w:pPr>
+      <w:r>
+        <w:rPr>
+          <w:lang w:val="en-CA"/>
+        </w:rPr>
+        <w:t xml:space="preserve">Units </w:t>
+      </w:r>
+      <w:r>
+        <w:rPr>
+          <w:lang w:val="en-CA"/>
+        </w:rPr>
+        <w:t>(</w:t>
+      </w:r>
+      <w:r>
+        <w:rPr>
+          <w:lang w:val="en-CA"/>
+        </w:rPr>
+        <w:t>mg/m^2/day</w:t>
+      </w:r>
+      <w:r>
+        <w:rPr>
+          <w:lang w:val="en-CA"/>
+        </w:rPr>
+        <w:t>), (umol/L/</w:t>
+      </w:r>
+      <w:r>
+        <w:rPr>
+          <w:lang w:val="en-CA"/>
+        </w:rPr>
+        <w:t>day</w:t>
+      </w:r>
+      <w:r>
+        <w:rPr>
+          <w:lang w:val="en-CA"/>
+        </w:rPr>
+        <w:t>), (g/day)</w:t>
+      </w:r>
+      <w:r>
+        <w:rPr>
+          <w:lang w:val="en-CA"/>
+        </w:rPr>
+        <w:t xml:space="preserve">, </w:t>
+      </w:r>
+      <w:r>
+        <w:rPr>
+          <w:lang w:val="en-CA"/>
+        </w:rPr>
+        <w:t xml:space="preserve">(umol/L/h), </w:t>
+      </w:r>
+      <w:bookmarkStart w:id="0" w:name="_GoBack"/>
+      <w:bookmarkEnd w:id="0"/>
+      <w:r>
+        <w:rPr>
+          <w:lang w:val="en-CA"/>
+        </w:rPr>
+        <w:t>or (umol/L)</w:t>
       </w:r>
     </w:p>
     <w:p>
@@ -3399,14 +3008,14 @@
         <w:rPr>
           <w:lang w:val="en-CA"/>
         </w:rPr>
-        <w:t>estimated – based on estimated excretion rates</w:t>
-      </w:r>
-    </w:p>
-    <w:p>
-      <w:pPr>
-        <w:pStyle w:val="ListParagraph"/>
-        <w:numPr>
-          <w:ilvl w:val="0"/>
+        <w:t>excretion – reported as excretion rate</w:t>
+      </w:r>
+    </w:p>
+    <w:p>
+      <w:pPr>
+        <w:pStyle w:val="ListParagraph"/>
+        <w:numPr>
+          <w:ilvl w:val="1"/>
           <w:numId w:val="16"/>
         </w:numPr>
         <w:rPr>
@@ -3417,7 +3026,25 @@
         <w:rPr>
           <w:lang w:val="en-CA"/>
         </w:rPr>
-        <w:t>excretion – reported as excretion rate</w:t>
+        <w:t>Units (</w:t>
+      </w:r>
+      <w:r>
+        <w:rPr>
+          <w:lang w:val="en-CA"/>
+        </w:rPr>
+        <w:t>mg/L/day</w:t>
+      </w:r>
+      <w:r>
+        <w:rPr>
+          <w:lang w:val="en-CA"/>
+        </w:rPr>
+        <w:t>)</w:t>
+      </w:r>
+      <w:r>
+        <w:rPr>
+          <w:lang w:val="en-CA"/>
+        </w:rPr>
+        <w:t>, (umol/L)</w:t>
       </w:r>
     </w:p>
     <w:p>
@@ -3434,22 +3061,12 @@
           <w:lang w:val="en-CA"/>
         </w:rPr>
       </w:pPr>
-      <w:proofErr w:type="spellStart"/>
-      <w:r>
-        <w:rPr>
-          <w:lang w:val="en-CA"/>
-        </w:rPr>
-        <w:t>background_nut</w:t>
-      </w:r>
-      <w:proofErr w:type="spellEnd"/>
-      <w:r>
-        <w:rPr>
-          <w:lang w:val="en-CA"/>
-        </w:rPr>
-        <w:t xml:space="preserve"> = nutrients present in system/control. NO3 + NO2 + NH4</w:t>
-      </w:r>
-      <w:bookmarkStart w:id="0" w:name="_GoBack"/>
-      <w:bookmarkEnd w:id="0"/>
+      <w:r>
+        <w:rPr>
+          <w:lang w:val="en-CA"/>
+        </w:rPr>
+        <w:t>background_nut = nutrients present in system/control. NO3 + NO2 + NH4</w:t>
+      </w:r>
     </w:p>
     <w:sectPr>
       <w:pgSz w:w="12240" w:h="15840"/>
@@ -5174,7 +4791,7 @@
         <w:rFonts w:ascii="Symbol" w:hAnsi="Symbol" w:hint="default"/>
       </w:rPr>
     </w:lvl>
-    <w:lvl w:ilvl="1" w:tplc="04090003" w:tentative="1">
+    <w:lvl w:ilvl="1" w:tplc="04090003">
       <w:start w:val="1"/>
       <w:numFmt w:val="bullet"/>
       <w:lvlText w:val="o"/>

</xml_diff>